<commit_message>
Docs: Update README with setup instructions and remove legacy documentation files
</commit_message>
<xml_diff>
--- a/Instructions.docx
+++ b/Instructions.docx
@@ -14,102 +14,46 @@
           <w:b/>
           <w:bCs/>
         </w:rPr>
-        <w:t>Here is a streamlined and comprehensive README.md file based on your instructions.</w:t>
-      </w:r>
-    </w:p>
-    <w:p>
-      <w:pPr>
-        <w:rPr>
-          <w:b/>
-          <w:bCs/>
-        </w:rPr>
-      </w:pPr>
-      <w:r>
-        <w:rPr>
-          <w:b/>
-          <w:bCs/>
-        </w:rPr>
-        <w:t xml:space="preserve">I've specifically tailored this for your friends on Macs by clarifying the commands (like using python3 instead of python), adding </w:t>
+        <w:t xml:space="preserve"># </w:t>
       </w:r>
       <w:proofErr w:type="spellStart"/>
-      <w:proofErr w:type="gramStart"/>
-      <w:r>
-        <w:rPr>
-          <w:b/>
-          <w:bCs/>
-        </w:rPr>
-        <w:t>a</w:t>
+      <w:r>
+        <w:rPr>
+          <w:b/>
+          <w:bCs/>
+        </w:rPr>
+        <w:t>ResaleSense</w:t>
       </w:r>
       <w:proofErr w:type="spellEnd"/>
-      <w:proofErr w:type="gramEnd"/>
-      <w:r>
-        <w:rPr>
-          <w:b/>
-          <w:bCs/>
-        </w:rPr>
-        <w:t xml:space="preserve"> explicit step for installing MongoDB with Homebrew (the most common Mac method), and providing a much-needed "Troubleshooting" section.</w:t>
-      </w:r>
-    </w:p>
-    <w:p>
-      <w:pPr>
-        <w:rPr>
-          <w:b/>
-          <w:bCs/>
-        </w:rPr>
-      </w:pPr>
-      <w:r>
-        <w:rPr>
-          <w:b/>
-          <w:bCs/>
-        </w:rPr>
-        <w:t>This version also simplifies the setup process by running commands from the root folder, which should prevent a lot of errors.</w:t>
-      </w:r>
-    </w:p>
-    <w:p>
-      <w:pPr>
-        <w:rPr>
-          <w:b/>
-          <w:bCs/>
-        </w:rPr>
-      </w:pPr>
-      <w:r>
-        <w:rPr>
-          <w:b/>
-          <w:bCs/>
-        </w:rPr>
-        <w:pict w14:anchorId="7AA3AD93">
-          <v:rect id="_x0000_i1025" style="width:0;height:1.5pt" o:hralign="center" o:hrstd="t" o:hrnoshade="t" o:hr="t" fillcolor="gray" stroked="f"/>
-        </w:pict>
-      </w:r>
-    </w:p>
-    <w:p>
-      <w:pPr>
-        <w:rPr>
-          <w:b/>
-          <w:bCs/>
-        </w:rPr>
-      </w:pPr>
-      <w:r>
-        <w:rPr>
-          <w:b/>
-          <w:bCs/>
-        </w:rPr>
-        <w:t>Markdown</w:t>
-      </w:r>
-    </w:p>
-    <w:p>
-      <w:pPr>
-        <w:rPr>
-          <w:b/>
-          <w:bCs/>
-        </w:rPr>
-      </w:pPr>
-      <w:r>
-        <w:rPr>
-          <w:b/>
-          <w:bCs/>
-        </w:rPr>
-        <w:t xml:space="preserve"># </w:t>
+      <w:r>
+        <w:rPr>
+          <w:b/>
+          <w:bCs/>
+        </w:rPr>
+        <w:t xml:space="preserve"> Project: Full Setup Guide</w:t>
+      </w:r>
+    </w:p>
+    <w:p>
+      <w:pPr>
+        <w:rPr>
+          <w:b/>
+          <w:bCs/>
+        </w:rPr>
+      </w:pPr>
+    </w:p>
+    <w:p>
+      <w:pPr>
+        <w:rPr>
+          <w:b/>
+          <w:bCs/>
+        </w:rPr>
+      </w:pPr>
+      <w:r>
+        <w:rPr>
+          <w:b/>
+          <w:bCs/>
+        </w:rPr>
+        <w:t xml:space="preserve">Welcome to the </w:t>
       </w:r>
       <w:proofErr w:type="spellStart"/>
       <w:r>
@@ -125,45 +69,6 @@
           <w:b/>
           <w:bCs/>
         </w:rPr>
-        <w:t xml:space="preserve"> Project: Full Setup Guide</w:t>
-      </w:r>
-    </w:p>
-    <w:p>
-      <w:pPr>
-        <w:rPr>
-          <w:b/>
-          <w:bCs/>
-        </w:rPr>
-      </w:pPr>
-    </w:p>
-    <w:p>
-      <w:pPr>
-        <w:rPr>
-          <w:b/>
-          <w:bCs/>
-        </w:rPr>
-      </w:pPr>
-      <w:r>
-        <w:rPr>
-          <w:b/>
-          <w:bCs/>
-        </w:rPr>
-        <w:t xml:space="preserve">Welcome to the </w:t>
-      </w:r>
-      <w:proofErr w:type="spellStart"/>
-      <w:r>
-        <w:rPr>
-          <w:b/>
-          <w:bCs/>
-        </w:rPr>
-        <w:t>ResaleSense</w:t>
-      </w:r>
-      <w:proofErr w:type="spellEnd"/>
-      <w:r>
-        <w:rPr>
-          <w:b/>
-          <w:bCs/>
-        </w:rPr>
         <w:t xml:space="preserve"> project! This guide will walk you through setting up and running all three services (Frontend, Backend, and Python ML Service) on your computer.</w:t>
       </w:r>
     </w:p>
@@ -187,22 +92,7 @@
           <w:b/>
           <w:bCs/>
         </w:rPr>
-        <w:t xml:space="preserve">## 1. </w:t>
-      </w:r>
-      <w:r>
-        <w:rPr>
-          <w:rFonts w:ascii="Segoe UI Emoji" w:hAnsi="Segoe UI Emoji" w:cs="Segoe UI Emoji"/>
-          <w:b/>
-          <w:bCs/>
-        </w:rPr>
-        <w:t>🚀</w:t>
-      </w:r>
-      <w:r>
-        <w:rPr>
-          <w:b/>
-          <w:bCs/>
-        </w:rPr>
-        <w:t xml:space="preserve"> Prerequisites (Before You Start)</w:t>
+        <w:t>## 1.  Prerequisites (Before You Start)</w:t>
       </w:r>
     </w:p>
     <w:p>
@@ -248,23 +138,7 @@
           <w:b/>
           <w:bCs/>
         </w:rPr>
-        <w:t>* **Node.js (v16</w:t>
-      </w:r>
-      <w:proofErr w:type="gramStart"/>
-      <w:r>
-        <w:rPr>
-          <w:b/>
-          <w:bCs/>
-        </w:rPr>
-        <w:t>+)*</w:t>
-      </w:r>
-      <w:proofErr w:type="gramEnd"/>
-      <w:r>
-        <w:rPr>
-          <w:b/>
-          <w:bCs/>
-        </w:rPr>
-        <w:t>*: Includes `</w:t>
+        <w:t>* **Node.js (v16+)**: Includes `</w:t>
       </w:r>
       <w:proofErr w:type="spellStart"/>
       <w:r>
@@ -304,82 +178,65 @@
           <w:i/>
           <w:iCs/>
         </w:rPr>
-        <w:t xml:space="preserve">*Check </w:t>
-      </w:r>
-      <w:proofErr w:type="gramStart"/>
-      <w:r>
+        <w:t>*Check version:*</w:t>
+      </w:r>
+      <w:r>
+        <w:rPr>
+          <w:b/>
+          <w:bCs/>
+        </w:rPr>
+        <w:t xml:space="preserve"> `node -v`</w:t>
+      </w:r>
+    </w:p>
+    <w:p>
+      <w:pPr>
+        <w:rPr>
+          <w:b/>
+          <w:bCs/>
+        </w:rPr>
+      </w:pPr>
+      <w:r>
+        <w:rPr>
+          <w:b/>
+          <w:bCs/>
+        </w:rPr>
+        <w:t>* **Python (v3.9+)**:</w:t>
+      </w:r>
+    </w:p>
+    <w:p>
+      <w:pPr>
         <w:rPr>
           <w:b/>
           <w:bCs/>
           <w:i/>
           <w:iCs/>
         </w:rPr>
-        <w:t>version:*</w:t>
-      </w:r>
-      <w:proofErr w:type="gramEnd"/>
-      <w:r>
-        <w:rPr>
-          <w:b/>
-          <w:bCs/>
-        </w:rPr>
-        <w:t xml:space="preserve"> `node -v`</w:t>
-      </w:r>
-    </w:p>
-    <w:p>
-      <w:pPr>
-        <w:rPr>
-          <w:b/>
-          <w:bCs/>
-        </w:rPr>
-      </w:pPr>
-      <w:r>
-        <w:rPr>
-          <w:b/>
-          <w:bCs/>
-        </w:rPr>
-        <w:t>* **Python (v3.9</w:t>
-      </w:r>
-      <w:proofErr w:type="gramStart"/>
-      <w:r>
-        <w:rPr>
-          <w:b/>
-          <w:bCs/>
-        </w:rPr>
-        <w:t>+)*</w:t>
-      </w:r>
-      <w:proofErr w:type="gramEnd"/>
-      <w:r>
-        <w:rPr>
-          <w:b/>
-          <w:bCs/>
-        </w:rPr>
-        <w:t>*:</w:t>
-      </w:r>
-    </w:p>
-    <w:p>
-      <w:pPr>
+      </w:pPr>
+      <w:r>
+        <w:rPr>
+          <w:b/>
+          <w:bCs/>
+        </w:rPr>
+        <w:t xml:space="preserve">    * [</w:t>
+      </w:r>
+      <w:proofErr w:type="spellStart"/>
+      <w:r>
+        <w:rPr>
+          <w:b/>
+          <w:bCs/>
+        </w:rPr>
+        <w:t>cite</w:t>
+      </w:r>
+      <w:r>
         <w:rPr>
           <w:b/>
           <w:bCs/>
           <w:i/>
           <w:iCs/>
         </w:rPr>
-      </w:pPr>
-      <w:r>
-        <w:rPr>
-          <w:b/>
-          <w:bCs/>
-        </w:rPr>
-        <w:t xml:space="preserve">    * [</w:t>
-      </w:r>
-      <w:proofErr w:type="spellStart"/>
-      <w:r>
-        <w:rPr>
-          <w:b/>
-          <w:bCs/>
-        </w:rPr>
-        <w:t>cite</w:t>
-      </w:r>
+        <w:t>_start</w:t>
+      </w:r>
+      <w:proofErr w:type="spellEnd"/>
       <w:r>
         <w:rPr>
           <w:b/>
@@ -387,19 +244,18 @@
           <w:i/>
           <w:iCs/>
         </w:rPr>
-        <w:t>_</w:t>
-      </w:r>
-      <w:proofErr w:type="gramStart"/>
-      <w:r>
+        <w:t>]*Check version:* `python3 -V` (Use `python3`, not `python`) [cite: 1740]</w:t>
+      </w:r>
+    </w:p>
+    <w:p>
+      <w:pPr>
         <w:rPr>
           <w:b/>
           <w:bCs/>
           <w:i/>
           <w:iCs/>
         </w:rPr>
-        <w:t>start</w:t>
-      </w:r>
-      <w:proofErr w:type="spellEnd"/>
+      </w:pPr>
       <w:r>
         <w:rPr>
           <w:b/>
@@ -407,9 +263,16 @@
           <w:i/>
           <w:iCs/>
         </w:rPr>
-        <w:t>]*</w:t>
-      </w:r>
-      <w:proofErr w:type="gramEnd"/>
+        <w:t>* **Git**:</w:t>
+      </w:r>
+    </w:p>
+    <w:p>
+      <w:pPr>
+        <w:rPr>
+          <w:b/>
+          <w:bCs/>
+        </w:rPr>
+      </w:pPr>
       <w:r>
         <w:rPr>
           <w:b/>
@@ -417,9 +280,9 @@
           <w:i/>
           <w:iCs/>
         </w:rPr>
-        <w:t xml:space="preserve">Check </w:t>
-      </w:r>
-      <w:proofErr w:type="gramStart"/>
+        <w:t xml:space="preserve">    * [</w:t>
+      </w:r>
+      <w:proofErr w:type="spellStart"/>
       <w:r>
         <w:rPr>
           <w:b/>
@@ -427,9 +290,23 @@
           <w:i/>
           <w:iCs/>
         </w:rPr>
-        <w:t>version:*</w:t>
-      </w:r>
-      <w:proofErr w:type="gramEnd"/>
+        <w:t>cite_</w:t>
+      </w:r>
+      <w:r>
+        <w:rPr>
+          <w:b/>
+          <w:bCs/>
+        </w:rPr>
+        <w:t>start</w:t>
+      </w:r>
+      <w:proofErr w:type="spellEnd"/>
+      <w:r>
+        <w:rPr>
+          <w:b/>
+          <w:bCs/>
+        </w:rPr>
+        <w:t>]</w:t>
+      </w:r>
       <w:r>
         <w:rPr>
           <w:b/>
@@ -437,18 +314,131 @@
           <w:i/>
           <w:iCs/>
         </w:rPr>
-        <w:t xml:space="preserve"> `python3 -V` (Use `python3`, not `python`) [cite: 1740]</w:t>
-      </w:r>
-    </w:p>
-    <w:p>
-      <w:pPr>
+        <w:t>*Check version:*</w:t>
+      </w:r>
+      <w:r>
+        <w:rPr>
+          <w:b/>
+          <w:bCs/>
+        </w:rPr>
+        <w:t xml:space="preserve"> `git --version` [cite: 1745]</w:t>
+      </w:r>
+    </w:p>
+    <w:p>
+      <w:pPr>
+        <w:rPr>
+          <w:b/>
+          <w:bCs/>
+        </w:rPr>
+      </w:pPr>
+      <w:r>
+        <w:rPr>
+          <w:b/>
+          <w:bCs/>
+        </w:rPr>
+        <w:t>* **MongoDB**: The database must be **installed and running**.</w:t>
+      </w:r>
+    </w:p>
+    <w:p>
+      <w:pPr>
+        <w:rPr>
+          <w:b/>
+          <w:bCs/>
+        </w:rPr>
+      </w:pPr>
+      <w:r>
+        <w:rPr>
+          <w:b/>
+          <w:bCs/>
+        </w:rPr>
+        <w:t xml:space="preserve">    * </w:t>
+      </w:r>
+      <w:r>
         <w:rPr>
           <w:b/>
           <w:bCs/>
           <w:i/>
           <w:iCs/>
         </w:rPr>
-      </w:pPr>
+        <w:t>*Mac Quick Install:*</w:t>
+      </w:r>
+    </w:p>
+    <w:p>
+      <w:pPr>
+        <w:rPr>
+          <w:b/>
+          <w:bCs/>
+        </w:rPr>
+      </w:pPr>
+      <w:r>
+        <w:rPr>
+          <w:b/>
+          <w:bCs/>
+        </w:rPr>
+        <w:t xml:space="preserve">        1.  `brew install </w:t>
+      </w:r>
+      <w:proofErr w:type="spellStart"/>
+      <w:r>
+        <w:rPr>
+          <w:b/>
+          <w:bCs/>
+        </w:rPr>
+        <w:t>mongodb</w:t>
+      </w:r>
+      <w:proofErr w:type="spellEnd"/>
+      <w:r>
+        <w:rPr>
+          <w:b/>
+          <w:bCs/>
+        </w:rPr>
+        <w:t>-community`</w:t>
+      </w:r>
+    </w:p>
+    <w:p>
+      <w:pPr>
+        <w:rPr>
+          <w:b/>
+          <w:bCs/>
+        </w:rPr>
+      </w:pPr>
+      <w:r>
+        <w:rPr>
+          <w:b/>
+          <w:bCs/>
+        </w:rPr>
+        <w:t xml:space="preserve">        2.  `brew services start </w:t>
+      </w:r>
+      <w:proofErr w:type="spellStart"/>
+      <w:r>
+        <w:rPr>
+          <w:b/>
+          <w:bCs/>
+        </w:rPr>
+        <w:t>mongodb</w:t>
+      </w:r>
+      <w:proofErr w:type="spellEnd"/>
+      <w:r>
+        <w:rPr>
+          <w:b/>
+          <w:bCs/>
+        </w:rPr>
+        <w:t>-community` (This runs it in the background)</w:t>
+      </w:r>
+    </w:p>
+    <w:p>
+      <w:pPr>
+        <w:rPr>
+          <w:b/>
+          <w:bCs/>
+        </w:rPr>
+      </w:pPr>
+      <w:r>
+        <w:rPr>
+          <w:b/>
+          <w:bCs/>
+        </w:rPr>
+        <w:t xml:space="preserve">    * </w:t>
+      </w:r>
       <w:r>
         <w:rPr>
           <w:b/>
@@ -456,22 +446,43 @@
           <w:i/>
           <w:iCs/>
         </w:rPr>
-        <w:t>* **Git**:</w:t>
-      </w:r>
-    </w:p>
-    <w:p>
-      <w:pPr>
-        <w:rPr>
-          <w:b/>
-          <w:bCs/>
-        </w:rPr>
-      </w:pPr>
-      <w:r>
-        <w:rPr>
-          <w:b/>
-          <w:bCs/>
-          <w:i/>
-          <w:iCs/>
+        <w:t>*Check if running:*</w:t>
+      </w:r>
+      <w:r>
+        <w:rPr>
+          <w:b/>
+          <w:bCs/>
+        </w:rPr>
+        <w:t xml:space="preserve"> Run `brew services list`. You should see `</w:t>
+      </w:r>
+      <w:proofErr w:type="spellStart"/>
+      <w:r>
+        <w:rPr>
+          <w:b/>
+          <w:bCs/>
+        </w:rPr>
+        <w:t>mongodb</w:t>
+      </w:r>
+      <w:proofErr w:type="spellEnd"/>
+      <w:r>
+        <w:rPr>
+          <w:b/>
+          <w:bCs/>
+        </w:rPr>
+        <w:t>-community` listed as "started".</w:t>
+      </w:r>
+    </w:p>
+    <w:p>
+      <w:pPr>
+        <w:rPr>
+          <w:b/>
+          <w:bCs/>
+        </w:rPr>
+      </w:pPr>
+      <w:r>
+        <w:rPr>
+          <w:b/>
+          <w:bCs/>
         </w:rPr>
         <w:t xml:space="preserve">    * [</w:t>
       </w:r>
@@ -480,18 +491,8 @@
         <w:rPr>
           <w:b/>
           <w:bCs/>
-          <w:i/>
-          <w:iCs/>
-        </w:rPr>
-        <w:t>cite_</w:t>
-      </w:r>
-      <w:proofErr w:type="gramStart"/>
-      <w:r>
-        <w:rPr>
-          <w:b/>
-          <w:bCs/>
-        </w:rPr>
-        <w:t>start</w:t>
+        </w:rPr>
+        <w:t>cite_start</w:t>
       </w:r>
       <w:proofErr w:type="spellEnd"/>
       <w:r>
@@ -499,109 +500,175 @@
           <w:b/>
           <w:bCs/>
         </w:rPr>
-        <w:t>]</w:t>
-      </w:r>
-      <w:r>
-        <w:rPr>
-          <w:b/>
-          <w:bCs/>
-          <w:i/>
-          <w:iCs/>
-        </w:rPr>
-        <w:t>*</w:t>
-      </w:r>
-      <w:proofErr w:type="gramEnd"/>
-      <w:r>
-        <w:rPr>
-          <w:b/>
-          <w:bCs/>
-          <w:i/>
-          <w:iCs/>
-        </w:rPr>
-        <w:t xml:space="preserve">Check </w:t>
-      </w:r>
-      <w:proofErr w:type="gramStart"/>
-      <w:r>
-        <w:rPr>
-          <w:b/>
-          <w:bCs/>
-          <w:i/>
-          <w:iCs/>
-        </w:rPr>
-        <w:t>version:*</w:t>
-      </w:r>
-      <w:proofErr w:type="gramEnd"/>
-      <w:r>
-        <w:rPr>
-          <w:b/>
-          <w:bCs/>
-        </w:rPr>
-        <w:t xml:space="preserve"> `git --version` [cite: 1745]</w:t>
-      </w:r>
-    </w:p>
-    <w:p>
-      <w:pPr>
-        <w:rPr>
-          <w:b/>
-          <w:bCs/>
-        </w:rPr>
-      </w:pPr>
-      <w:r>
-        <w:rPr>
-          <w:b/>
-          <w:bCs/>
-        </w:rPr>
-        <w:t>* **MongoDB**: The database must be **installed and running**.</w:t>
-      </w:r>
-    </w:p>
-    <w:p>
-      <w:pPr>
-        <w:rPr>
-          <w:b/>
-          <w:bCs/>
-        </w:rPr>
-      </w:pPr>
-      <w:r>
-        <w:rPr>
-          <w:b/>
-          <w:bCs/>
-        </w:rPr>
-        <w:t xml:space="preserve">    * </w:t>
-      </w:r>
-      <w:r>
-        <w:rPr>
-          <w:b/>
-          <w:bCs/>
-          <w:i/>
-          <w:iCs/>
-        </w:rPr>
-        <w:t xml:space="preserve">*Mac Quick </w:t>
-      </w:r>
-      <w:proofErr w:type="gramStart"/>
-      <w:r>
-        <w:rPr>
-          <w:b/>
-          <w:bCs/>
-          <w:i/>
-          <w:iCs/>
-        </w:rPr>
-        <w:t>Install:*</w:t>
-      </w:r>
-      <w:proofErr w:type="gramEnd"/>
-    </w:p>
-    <w:p>
-      <w:pPr>
-        <w:rPr>
-          <w:b/>
-          <w:bCs/>
-        </w:rPr>
-      </w:pPr>
-      <w:r>
-        <w:rPr>
-          <w:b/>
-          <w:bCs/>
-        </w:rPr>
-        <w:t xml:space="preserve">        1.  `brew install </w:t>
+        <w:t>](You can also use MongoDB Atlas [cite: 1743] or Docker[cite: 1744], but Homebrew is fastest for local setup.)</w:t>
+      </w:r>
+    </w:p>
+    <w:p>
+      <w:pPr>
+        <w:rPr>
+          <w:b/>
+          <w:bCs/>
+        </w:rPr>
+      </w:pPr>
+    </w:p>
+    <w:p>
+      <w:pPr>
+        <w:rPr>
+          <w:b/>
+          <w:bCs/>
+        </w:rPr>
+      </w:pPr>
+      <w:r>
+        <w:rPr>
+          <w:b/>
+          <w:bCs/>
+        </w:rPr>
+        <w:t>---</w:t>
+      </w:r>
+    </w:p>
+    <w:p>
+      <w:pPr>
+        <w:rPr>
+          <w:b/>
+          <w:bCs/>
+        </w:rPr>
+      </w:pPr>
+    </w:p>
+    <w:p>
+      <w:pPr>
+        <w:rPr>
+          <w:b/>
+          <w:bCs/>
+        </w:rPr>
+      </w:pPr>
+      <w:r>
+        <w:rPr>
+          <w:b/>
+          <w:bCs/>
+        </w:rPr>
+        <w:t>## 2. One-Time Setup</w:t>
+      </w:r>
+    </w:p>
+    <w:p>
+      <w:pPr>
+        <w:rPr>
+          <w:b/>
+          <w:bCs/>
+        </w:rPr>
+      </w:pPr>
+    </w:p>
+    <w:p>
+      <w:pPr>
+        <w:rPr>
+          <w:b/>
+          <w:bCs/>
+        </w:rPr>
+      </w:pPr>
+      <w:r>
+        <w:rPr>
+          <w:b/>
+          <w:bCs/>
+        </w:rPr>
+        <w:t>You only need to do these steps once.</w:t>
+      </w:r>
+    </w:p>
+    <w:p>
+      <w:pPr>
+        <w:rPr>
+          <w:b/>
+          <w:bCs/>
+        </w:rPr>
+      </w:pPr>
+    </w:p>
+    <w:p>
+      <w:pPr>
+        <w:rPr>
+          <w:b/>
+          <w:bCs/>
+        </w:rPr>
+      </w:pPr>
+      <w:r>
+        <w:rPr>
+          <w:b/>
+          <w:bCs/>
+        </w:rPr>
+        <w:t>### Step 1: Clone and Install Dependencies</w:t>
+      </w:r>
+    </w:p>
+    <w:p>
+      <w:pPr>
+        <w:rPr>
+          <w:b/>
+          <w:bCs/>
+        </w:rPr>
+      </w:pPr>
+    </w:p>
+    <w:p>
+      <w:pPr>
+        <w:rPr>
+          <w:b/>
+          <w:bCs/>
+        </w:rPr>
+      </w:pPr>
+      <w:r>
+        <w:rPr>
+          <w:b/>
+          <w:bCs/>
+        </w:rPr>
+        <w:t>These commands are run from your main terminal.</w:t>
+      </w:r>
+    </w:p>
+    <w:p>
+      <w:pPr>
+        <w:rPr>
+          <w:b/>
+          <w:bCs/>
+        </w:rPr>
+      </w:pPr>
+    </w:p>
+    <w:p>
+      <w:pPr>
+        <w:rPr>
+          <w:b/>
+          <w:bCs/>
+        </w:rPr>
+      </w:pPr>
+      <w:r>
+        <w:rPr>
+          <w:b/>
+          <w:bCs/>
+        </w:rPr>
+        <w:t>```bash</w:t>
+      </w:r>
+    </w:p>
+    <w:p>
+      <w:pPr>
+        <w:rPr>
+          <w:b/>
+          <w:bCs/>
+        </w:rPr>
+      </w:pPr>
+      <w:r>
+        <w:rPr>
+          <w:b/>
+          <w:bCs/>
+        </w:rPr>
+        <w:t># 1. Clone the project repository</w:t>
+      </w:r>
+    </w:p>
+    <w:p>
+      <w:pPr>
+        <w:rPr>
+          <w:b/>
+          <w:bCs/>
+        </w:rPr>
+      </w:pPr>
+      <w:r>
+        <w:rPr>
+          <w:b/>
+          <w:bCs/>
+        </w:rPr>
+        <w:t>git clone &lt;your-repository-</w:t>
       </w:r>
       <w:proofErr w:type="spellStart"/>
       <w:r>
@@ -609,7 +676,7 @@
           <w:b/>
           <w:bCs/>
         </w:rPr>
-        <w:t>mongodb</w:t>
+        <w:t>url</w:t>
       </w:r>
       <w:proofErr w:type="spellEnd"/>
       <w:r>
@@ -617,22 +684,22 @@
           <w:b/>
           <w:bCs/>
         </w:rPr>
-        <w:t>-community`</w:t>
-      </w:r>
-    </w:p>
-    <w:p>
-      <w:pPr>
-        <w:rPr>
-          <w:b/>
-          <w:bCs/>
-        </w:rPr>
-      </w:pPr>
-      <w:r>
-        <w:rPr>
-          <w:b/>
-          <w:bCs/>
-        </w:rPr>
-        <w:t xml:space="preserve">        2.  `brew services start </w:t>
+        <w:t xml:space="preserve">&gt; </w:t>
+      </w:r>
+    </w:p>
+    <w:p>
+      <w:pPr>
+        <w:rPr>
+          <w:b/>
+          <w:bCs/>
+        </w:rPr>
+      </w:pPr>
+      <w:r>
+        <w:rPr>
+          <w:b/>
+          <w:bCs/>
+        </w:rPr>
+        <w:t xml:space="preserve">cd </w:t>
       </w:r>
       <w:proofErr w:type="spellStart"/>
       <w:r>
@@ -640,7 +707,7 @@
           <w:b/>
           <w:bCs/>
         </w:rPr>
-        <w:t>mongodb</w:t>
+        <w:t>ResaleSense</w:t>
       </w:r>
       <w:proofErr w:type="spellEnd"/>
       <w:r>
@@ -648,57 +715,46 @@
           <w:b/>
           <w:bCs/>
         </w:rPr>
-        <w:t>-community` (This runs it in the background)</w:t>
-      </w:r>
-    </w:p>
-    <w:p>
-      <w:pPr>
-        <w:rPr>
-          <w:b/>
-          <w:bCs/>
-        </w:rPr>
-      </w:pPr>
-      <w:r>
-        <w:rPr>
-          <w:b/>
-          <w:bCs/>
-        </w:rPr>
-        <w:t xml:space="preserve">    * </w:t>
-      </w:r>
-      <w:r>
-        <w:rPr>
-          <w:b/>
-          <w:bCs/>
-          <w:i/>
-          <w:iCs/>
-        </w:rPr>
-        <w:t xml:space="preserve">*Check if </w:t>
-      </w:r>
-      <w:proofErr w:type="gramStart"/>
-      <w:r>
-        <w:rPr>
-          <w:b/>
-          <w:bCs/>
-          <w:i/>
-          <w:iCs/>
-        </w:rPr>
-        <w:t>running:*</w:t>
-      </w:r>
-      <w:proofErr w:type="gramEnd"/>
-      <w:r>
-        <w:rPr>
-          <w:b/>
-          <w:bCs/>
-        </w:rPr>
-        <w:t xml:space="preserve"> Run `brew services list`. You should see `</w:t>
-      </w:r>
+        <w:t xml:space="preserve">-Project </w:t>
+      </w:r>
+    </w:p>
+    <w:p>
+      <w:pPr>
+        <w:rPr>
+          <w:b/>
+          <w:bCs/>
+        </w:rPr>
+      </w:pPr>
+    </w:p>
+    <w:p>
+      <w:pPr>
+        <w:rPr>
+          <w:b/>
+          <w:bCs/>
+        </w:rPr>
+      </w:pPr>
+      <w:r>
+        <w:rPr>
+          <w:b/>
+          <w:bCs/>
+        </w:rPr>
+        <w:t># 2. Install the root 'concurrently' package</w:t>
+      </w:r>
+    </w:p>
+    <w:p>
+      <w:pPr>
+        <w:rPr>
+          <w:b/>
+          <w:bCs/>
+        </w:rPr>
+      </w:pPr>
       <w:proofErr w:type="spellStart"/>
       <w:r>
         <w:rPr>
           <w:b/>
           <w:bCs/>
         </w:rPr>
-        <w:t>mongodb</w:t>
+        <w:t>npm</w:t>
       </w:r>
       <w:proofErr w:type="spellEnd"/>
       <w:r>
@@ -706,38 +762,46 @@
           <w:b/>
           <w:bCs/>
         </w:rPr>
-        <w:t>-community` listed as "started".</w:t>
-      </w:r>
-    </w:p>
-    <w:p>
-      <w:pPr>
-        <w:rPr>
-          <w:b/>
-          <w:bCs/>
-        </w:rPr>
-      </w:pPr>
-      <w:r>
-        <w:rPr>
-          <w:b/>
-          <w:bCs/>
-        </w:rPr>
-        <w:t xml:space="preserve">    * [</w:t>
-      </w:r>
+        <w:t xml:space="preserve"> install </w:t>
+      </w:r>
+    </w:p>
+    <w:p>
+      <w:pPr>
+        <w:rPr>
+          <w:b/>
+          <w:bCs/>
+        </w:rPr>
+      </w:pPr>
+    </w:p>
+    <w:p>
+      <w:pPr>
+        <w:rPr>
+          <w:b/>
+          <w:bCs/>
+        </w:rPr>
+      </w:pPr>
+      <w:r>
+        <w:rPr>
+          <w:b/>
+          <w:bCs/>
+        </w:rPr>
+        <w:t># 3. Install Backend dependencies (from the root folder)</w:t>
+      </w:r>
+    </w:p>
+    <w:p>
+      <w:pPr>
+        <w:rPr>
+          <w:b/>
+          <w:bCs/>
+        </w:rPr>
+      </w:pPr>
       <w:proofErr w:type="spellStart"/>
       <w:r>
         <w:rPr>
           <w:b/>
           <w:bCs/>
         </w:rPr>
-        <w:t>cite_</w:t>
-      </w:r>
-      <w:proofErr w:type="gramStart"/>
-      <w:r>
-        <w:rPr>
-          <w:b/>
-          <w:bCs/>
-        </w:rPr>
-        <w:t>start</w:t>
+        <w:t>npm</w:t>
       </w:r>
       <w:proofErr w:type="spellEnd"/>
       <w:r>
@@ -745,40 +809,385 @@
           <w:b/>
           <w:bCs/>
         </w:rPr>
-        <w:t>](</w:t>
-      </w:r>
-      <w:proofErr w:type="gramEnd"/>
-      <w:r>
-        <w:rPr>
-          <w:b/>
-          <w:bCs/>
-        </w:rPr>
-        <w:t xml:space="preserve">You can also use MongoDB Atlas [cite: 1743] or </w:t>
-      </w:r>
-      <w:proofErr w:type="gramStart"/>
-      <w:r>
-        <w:rPr>
-          <w:b/>
-          <w:bCs/>
-        </w:rPr>
-        <w:t>Docker[</w:t>
-      </w:r>
-      <w:proofErr w:type="gramEnd"/>
-      <w:r>
-        <w:rPr>
-          <w:b/>
-          <w:bCs/>
-        </w:rPr>
-        <w:t>cite: 1744], but Homebrew is fastest for local setup.)</w:t>
-      </w:r>
-    </w:p>
-    <w:p>
-      <w:pPr>
-        <w:rPr>
-          <w:b/>
-          <w:bCs/>
-        </w:rPr>
-      </w:pPr>
+        <w:t xml:space="preserve"> install --prefix </w:t>
+      </w:r>
+      <w:proofErr w:type="spellStart"/>
+      <w:r>
+        <w:rPr>
+          <w:b/>
+          <w:bCs/>
+        </w:rPr>
+        <w:t>ResaleSense</w:t>
+      </w:r>
+      <w:proofErr w:type="spellEnd"/>
+      <w:r>
+        <w:rPr>
+          <w:b/>
+          <w:bCs/>
+        </w:rPr>
+        <w:t xml:space="preserve">-Backend </w:t>
+      </w:r>
+    </w:p>
+    <w:p>
+      <w:pPr>
+        <w:rPr>
+          <w:b/>
+          <w:bCs/>
+        </w:rPr>
+      </w:pPr>
+    </w:p>
+    <w:p>
+      <w:pPr>
+        <w:rPr>
+          <w:b/>
+          <w:bCs/>
+        </w:rPr>
+      </w:pPr>
+      <w:r>
+        <w:rPr>
+          <w:b/>
+          <w:bCs/>
+        </w:rPr>
+        <w:t># 4. Install Frontend dependencies (from the root folder)</w:t>
+      </w:r>
+    </w:p>
+    <w:p>
+      <w:pPr>
+        <w:rPr>
+          <w:b/>
+          <w:bCs/>
+        </w:rPr>
+      </w:pPr>
+      <w:proofErr w:type="spellStart"/>
+      <w:r>
+        <w:rPr>
+          <w:b/>
+          <w:bCs/>
+        </w:rPr>
+        <w:t>npm</w:t>
+      </w:r>
+      <w:proofErr w:type="spellEnd"/>
+      <w:r>
+        <w:rPr>
+          <w:b/>
+          <w:bCs/>
+        </w:rPr>
+        <w:t xml:space="preserve"> install --prefix </w:t>
+      </w:r>
+      <w:proofErr w:type="spellStart"/>
+      <w:r>
+        <w:rPr>
+          <w:b/>
+          <w:bCs/>
+        </w:rPr>
+        <w:t>resalesense</w:t>
+      </w:r>
+      <w:proofErr w:type="spellEnd"/>
+      <w:r>
+        <w:rPr>
+          <w:b/>
+          <w:bCs/>
+        </w:rPr>
+        <w:t xml:space="preserve">-frontend </w:t>
+      </w:r>
+    </w:p>
+    <w:p>
+      <w:pPr>
+        <w:rPr>
+          <w:b/>
+          <w:bCs/>
+        </w:rPr>
+      </w:pPr>
+      <w:r>
+        <w:rPr>
+          <w:b/>
+          <w:bCs/>
+        </w:rPr>
+        <w:t>Step 2: Configure the Backend (.env)</w:t>
+      </w:r>
+    </w:p>
+    <w:p>
+      <w:pPr>
+        <w:rPr>
+          <w:b/>
+          <w:bCs/>
+        </w:rPr>
+      </w:pPr>
+      <w:r>
+        <w:rPr>
+          <w:b/>
+          <w:bCs/>
+        </w:rPr>
+        <w:t>The backend needs to know how to connect to your MongoDB database.</w:t>
+      </w:r>
+    </w:p>
+    <w:p>
+      <w:pPr>
+        <w:rPr>
+          <w:b/>
+          <w:bCs/>
+        </w:rPr>
+      </w:pPr>
+      <w:r>
+        <w:rPr>
+          <w:b/>
+          <w:bCs/>
+        </w:rPr>
+        <w:t>Bash</w:t>
+      </w:r>
+    </w:p>
+    <w:p>
+      <w:pPr>
+        <w:rPr>
+          <w:b/>
+          <w:bCs/>
+        </w:rPr>
+      </w:pPr>
+      <w:r>
+        <w:rPr>
+          <w:b/>
+          <w:bCs/>
+        </w:rPr>
+        <w:t># 1. From the root '</w:t>
+      </w:r>
+      <w:proofErr w:type="spellStart"/>
+      <w:r>
+        <w:rPr>
+          <w:b/>
+          <w:bCs/>
+        </w:rPr>
+        <w:t>ResaleSense</w:t>
+      </w:r>
+      <w:proofErr w:type="spellEnd"/>
+      <w:r>
+        <w:rPr>
+          <w:b/>
+          <w:bCs/>
+        </w:rPr>
+        <w:t>-Project' folder, copy the example .env file</w:t>
+      </w:r>
+    </w:p>
+    <w:p>
+      <w:pPr>
+        <w:rPr>
+          <w:b/>
+          <w:bCs/>
+        </w:rPr>
+      </w:pPr>
+      <w:r>
+        <w:rPr>
+          <w:b/>
+          <w:bCs/>
+        </w:rPr>
+        <w:t xml:space="preserve">cp </w:t>
+      </w:r>
+      <w:proofErr w:type="spellStart"/>
+      <w:r>
+        <w:rPr>
+          <w:b/>
+          <w:bCs/>
+        </w:rPr>
+        <w:t>ResaleSense</w:t>
+      </w:r>
+      <w:proofErr w:type="spellEnd"/>
+      <w:r>
+        <w:rPr>
+          <w:b/>
+          <w:bCs/>
+        </w:rPr>
+        <w:t>-Backend/.</w:t>
+      </w:r>
+      <w:proofErr w:type="spellStart"/>
+      <w:r>
+        <w:rPr>
+          <w:b/>
+          <w:bCs/>
+        </w:rPr>
+        <w:t>env.example</w:t>
+      </w:r>
+      <w:proofErr w:type="spellEnd"/>
+      <w:r>
+        <w:rPr>
+          <w:b/>
+          <w:bCs/>
+        </w:rPr>
+        <w:t xml:space="preserve"> </w:t>
+      </w:r>
+      <w:proofErr w:type="spellStart"/>
+      <w:r>
+        <w:rPr>
+          <w:b/>
+          <w:bCs/>
+        </w:rPr>
+        <w:t>ResaleSense</w:t>
+      </w:r>
+      <w:proofErr w:type="spellEnd"/>
+      <w:r>
+        <w:rPr>
+          <w:b/>
+          <w:bCs/>
+        </w:rPr>
+        <w:t xml:space="preserve">-Backend/.env </w:t>
+      </w:r>
+    </w:p>
+    <w:p>
+      <w:pPr>
+        <w:rPr>
+          <w:b/>
+          <w:bCs/>
+        </w:rPr>
+      </w:pPr>
+    </w:p>
+    <w:p>
+      <w:pPr>
+        <w:rPr>
+          <w:b/>
+          <w:bCs/>
+        </w:rPr>
+      </w:pPr>
+      <w:r>
+        <w:rPr>
+          <w:b/>
+          <w:bCs/>
+        </w:rPr>
+        <w:t xml:space="preserve"># 2. Open the new file: </w:t>
+      </w:r>
+      <w:proofErr w:type="spellStart"/>
+      <w:r>
+        <w:rPr>
+          <w:b/>
+          <w:bCs/>
+        </w:rPr>
+        <w:t>ResaleSense</w:t>
+      </w:r>
+      <w:proofErr w:type="spellEnd"/>
+      <w:r>
+        <w:rPr>
+          <w:b/>
+          <w:bCs/>
+        </w:rPr>
+        <w:t>-Backend/.env</w:t>
+      </w:r>
+    </w:p>
+    <w:p>
+      <w:pPr>
+        <w:rPr>
+          <w:b/>
+          <w:bCs/>
+        </w:rPr>
+      </w:pPr>
+      <w:r>
+        <w:rPr>
+          <w:b/>
+          <w:bCs/>
+        </w:rPr>
+        <w:t>Inside this file, change this line:</w:t>
+      </w:r>
+    </w:p>
+    <w:p>
+      <w:pPr>
+        <w:rPr>
+          <w:b/>
+          <w:bCs/>
+        </w:rPr>
+      </w:pPr>
+      <w:r>
+        <w:rPr>
+          <w:b/>
+          <w:bCs/>
+        </w:rPr>
+        <w:t>MONGODB_URI=YOUR_MONGODB_CONNECTION_STRING</w:t>
+      </w:r>
+    </w:p>
+    <w:p>
+      <w:pPr>
+        <w:rPr>
+          <w:b/>
+          <w:bCs/>
+        </w:rPr>
+      </w:pPr>
+      <w:r>
+        <w:rPr>
+          <w:b/>
+          <w:bCs/>
+        </w:rPr>
+        <w:t>...to this (if you used the Homebrew install):</w:t>
+      </w:r>
+    </w:p>
+    <w:p>
+      <w:pPr>
+        <w:rPr>
+          <w:b/>
+          <w:bCs/>
+        </w:rPr>
+      </w:pPr>
+      <w:r>
+        <w:rPr>
+          <w:b/>
+          <w:bCs/>
+        </w:rPr>
+        <w:t>MONGODB_URI=mongodb://localhost:27017/resalesense</w:t>
+      </w:r>
+    </w:p>
+    <w:p>
+      <w:pPr>
+        <w:rPr>
+          <w:b/>
+          <w:bCs/>
+        </w:rPr>
+      </w:pPr>
+      <w:r>
+        <w:rPr>
+          <w:b/>
+          <w:bCs/>
+        </w:rPr>
+        <w:t>(If you're using MongoDB Atlas, paste your cloud connection string here.) 1</w:t>
+      </w:r>
+    </w:p>
+    <w:p>
+      <w:pPr>
+        <w:rPr>
+          <w:b/>
+          <w:bCs/>
+        </w:rPr>
+      </w:pPr>
+      <w:r>
+        <w:rPr>
+          <w:b/>
+          <w:bCs/>
+        </w:rPr>
+        <w:t>Step 3: Configure the Python Service (Virtual Environment)</w:t>
+      </w:r>
+    </w:p>
+    <w:p>
+      <w:pPr>
+        <w:rPr>
+          <w:b/>
+          <w:bCs/>
+        </w:rPr>
+      </w:pPr>
+      <w:r>
+        <w:rPr>
+          <w:b/>
+          <w:bCs/>
+        </w:rPr>
+        <w:t>This creates a self-contained Python environment so it doesn't mess with your main system.</w:t>
+      </w:r>
+    </w:p>
+    <w:p>
+      <w:pPr>
+        <w:rPr>
+          <w:b/>
+          <w:bCs/>
+        </w:rPr>
+      </w:pPr>
+      <w:r>
+        <w:rPr>
+          <w:b/>
+          <w:bCs/>
+        </w:rPr>
+        <w:t>Bash</w:t>
+      </w:r>
     </w:p>
     <w:p>
       <w:pPr>
@@ -793,167 +1202,22 @@
           <w:bCs/>
         </w:rPr>
         <w:lastRenderedPageBreak/>
-        <w:t>---</w:t>
-      </w:r>
-    </w:p>
-    <w:p>
-      <w:pPr>
-        <w:rPr>
-          <w:b/>
-          <w:bCs/>
-        </w:rPr>
-      </w:pPr>
-    </w:p>
-    <w:p>
-      <w:pPr>
-        <w:rPr>
-          <w:b/>
-          <w:bCs/>
-        </w:rPr>
-      </w:pPr>
-      <w:r>
-        <w:rPr>
-          <w:b/>
-          <w:bCs/>
-        </w:rPr>
-        <w:t xml:space="preserve">## 2. </w:t>
-      </w:r>
-      <w:r>
-        <w:rPr>
-          <w:rFonts w:ascii="Segoe UI Emoji" w:hAnsi="Segoe UI Emoji" w:cs="Segoe UI Emoji"/>
-          <w:b/>
-          <w:bCs/>
-        </w:rPr>
-        <w:t>⚙️</w:t>
-      </w:r>
-      <w:r>
-        <w:rPr>
-          <w:b/>
-          <w:bCs/>
-        </w:rPr>
-        <w:t xml:space="preserve"> One-Time Setup</w:t>
-      </w:r>
-    </w:p>
-    <w:p>
-      <w:pPr>
-        <w:rPr>
-          <w:b/>
-          <w:bCs/>
-        </w:rPr>
-      </w:pPr>
-    </w:p>
-    <w:p>
-      <w:pPr>
-        <w:rPr>
-          <w:b/>
-          <w:bCs/>
-        </w:rPr>
-      </w:pPr>
-      <w:r>
-        <w:rPr>
-          <w:b/>
-          <w:bCs/>
-        </w:rPr>
-        <w:t>You only need to do these steps once.</w:t>
-      </w:r>
-    </w:p>
-    <w:p>
-      <w:pPr>
-        <w:rPr>
-          <w:b/>
-          <w:bCs/>
-        </w:rPr>
-      </w:pPr>
-    </w:p>
-    <w:p>
-      <w:pPr>
-        <w:rPr>
-          <w:b/>
-          <w:bCs/>
-        </w:rPr>
-      </w:pPr>
-      <w:r>
-        <w:rPr>
-          <w:b/>
-          <w:bCs/>
-        </w:rPr>
-        <w:t>### Step 1: Clone and Install Dependencies</w:t>
-      </w:r>
-    </w:p>
-    <w:p>
-      <w:pPr>
-        <w:rPr>
-          <w:b/>
-          <w:bCs/>
-        </w:rPr>
-      </w:pPr>
-    </w:p>
-    <w:p>
-      <w:pPr>
-        <w:rPr>
-          <w:b/>
-          <w:bCs/>
-        </w:rPr>
-      </w:pPr>
-      <w:r>
-        <w:rPr>
-          <w:b/>
-          <w:bCs/>
-        </w:rPr>
-        <w:t>These commands are run from your main terminal.</w:t>
-      </w:r>
-    </w:p>
-    <w:p>
-      <w:pPr>
-        <w:rPr>
-          <w:b/>
-          <w:bCs/>
-        </w:rPr>
-      </w:pPr>
-    </w:p>
-    <w:p>
-      <w:pPr>
-        <w:rPr>
-          <w:b/>
-          <w:bCs/>
-        </w:rPr>
-      </w:pPr>
-      <w:r>
-        <w:rPr>
-          <w:b/>
-          <w:bCs/>
-        </w:rPr>
-        <w:t>```bash</w:t>
-      </w:r>
-    </w:p>
-    <w:p>
-      <w:pPr>
-        <w:rPr>
-          <w:b/>
-          <w:bCs/>
-        </w:rPr>
-      </w:pPr>
-      <w:r>
-        <w:rPr>
-          <w:b/>
-          <w:bCs/>
-        </w:rPr>
-        <w:t># 1. Clone the project repository</w:t>
-      </w:r>
-    </w:p>
-    <w:p>
-      <w:pPr>
-        <w:rPr>
-          <w:b/>
-          <w:bCs/>
-        </w:rPr>
-      </w:pPr>
-      <w:r>
-        <w:rPr>
-          <w:b/>
-          <w:bCs/>
-        </w:rPr>
-        <w:t>git clone &lt;your-repository-</w:t>
+        <w:t># 1. Navigate into the Python folder</w:t>
+      </w:r>
+    </w:p>
+    <w:p>
+      <w:pPr>
+        <w:rPr>
+          <w:b/>
+          <w:bCs/>
+        </w:rPr>
+      </w:pPr>
+      <w:r>
+        <w:rPr>
+          <w:b/>
+          <w:bCs/>
+        </w:rPr>
+        <w:t xml:space="preserve">cd </w:t>
       </w:r>
       <w:proofErr w:type="spellStart"/>
       <w:r>
@@ -961,7 +1225,7 @@
           <w:b/>
           <w:bCs/>
         </w:rPr>
-        <w:t>url</w:t>
+        <w:t>ResaleSense</w:t>
       </w:r>
       <w:proofErr w:type="spellEnd"/>
       <w:r>
@@ -969,22 +1233,45 @@
           <w:b/>
           <w:bCs/>
         </w:rPr>
-        <w:t xml:space="preserve">&gt; </w:t>
-      </w:r>
-    </w:p>
-    <w:p>
-      <w:pPr>
-        <w:rPr>
-          <w:b/>
-          <w:bCs/>
-        </w:rPr>
-      </w:pPr>
-      <w:r>
-        <w:rPr>
-          <w:b/>
-          <w:bCs/>
-        </w:rPr>
-        <w:t xml:space="preserve">cd </w:t>
+        <w:t xml:space="preserve">-Prediction-Service </w:t>
+      </w:r>
+    </w:p>
+    <w:p>
+      <w:pPr>
+        <w:rPr>
+          <w:b/>
+          <w:bCs/>
+        </w:rPr>
+      </w:pPr>
+    </w:p>
+    <w:p>
+      <w:pPr>
+        <w:rPr>
+          <w:b/>
+          <w:bCs/>
+        </w:rPr>
+      </w:pPr>
+      <w:r>
+        <w:rPr>
+          <w:b/>
+          <w:bCs/>
+        </w:rPr>
+        <w:t># 2. Create the virtual environment (use python3 for Mac)</w:t>
+      </w:r>
+    </w:p>
+    <w:p>
+      <w:pPr>
+        <w:rPr>
+          <w:b/>
+          <w:bCs/>
+        </w:rPr>
+      </w:pPr>
+      <w:r>
+        <w:rPr>
+          <w:b/>
+          <w:bCs/>
+        </w:rPr>
+        <w:t xml:space="preserve">python3 -m </w:t>
       </w:r>
       <w:proofErr w:type="spellStart"/>
       <w:r>
@@ -992,7 +1279,7 @@
           <w:b/>
           <w:bCs/>
         </w:rPr>
-        <w:t>ResaleSense</w:t>
+        <w:t>venv</w:t>
       </w:r>
       <w:proofErr w:type="spellEnd"/>
       <w:r>
@@ -1000,46 +1287,15 @@
           <w:b/>
           <w:bCs/>
         </w:rPr>
-        <w:t xml:space="preserve">-Project </w:t>
-      </w:r>
-    </w:p>
-    <w:p>
-      <w:pPr>
-        <w:rPr>
-          <w:b/>
-          <w:bCs/>
-        </w:rPr>
-      </w:pPr>
-    </w:p>
-    <w:p>
-      <w:pPr>
-        <w:rPr>
-          <w:b/>
-          <w:bCs/>
-        </w:rPr>
-      </w:pPr>
-      <w:r>
-        <w:rPr>
-          <w:b/>
-          <w:bCs/>
-        </w:rPr>
-        <w:t># 2. Install the root 'concurrently' package</w:t>
-      </w:r>
-    </w:p>
-    <w:p>
-      <w:pPr>
-        <w:rPr>
-          <w:b/>
-          <w:bCs/>
-        </w:rPr>
-      </w:pPr>
+        <w:t xml:space="preserve"> </w:t>
+      </w:r>
       <w:proofErr w:type="spellStart"/>
       <w:r>
         <w:rPr>
           <w:b/>
           <w:bCs/>
         </w:rPr>
-        <w:t>npm</w:t>
+        <w:t>venv</w:t>
       </w:r>
       <w:proofErr w:type="spellEnd"/>
       <w:r>
@@ -1047,46 +1303,53 @@
           <w:b/>
           <w:bCs/>
         </w:rPr>
-        <w:t xml:space="preserve"> install </w:t>
-      </w:r>
-    </w:p>
-    <w:p>
-      <w:pPr>
-        <w:rPr>
-          <w:b/>
-          <w:bCs/>
-        </w:rPr>
-      </w:pPr>
-    </w:p>
-    <w:p>
-      <w:pPr>
-        <w:rPr>
-          <w:b/>
-          <w:bCs/>
-        </w:rPr>
-      </w:pPr>
-      <w:r>
-        <w:rPr>
-          <w:b/>
-          <w:bCs/>
-        </w:rPr>
-        <w:t># 3. Install Backend dependencies (from the root folder)</w:t>
-      </w:r>
-    </w:p>
-    <w:p>
-      <w:pPr>
-        <w:rPr>
-          <w:b/>
-          <w:bCs/>
-        </w:rPr>
-      </w:pPr>
+        <w:t xml:space="preserve"> </w:t>
+      </w:r>
+    </w:p>
+    <w:p>
+      <w:pPr>
+        <w:rPr>
+          <w:b/>
+          <w:bCs/>
+        </w:rPr>
+      </w:pPr>
+    </w:p>
+    <w:p>
+      <w:pPr>
+        <w:rPr>
+          <w:b/>
+          <w:bCs/>
+        </w:rPr>
+      </w:pPr>
+      <w:r>
+        <w:rPr>
+          <w:b/>
+          <w:bCs/>
+        </w:rPr>
+        <w:t># 3. Activate the environment</w:t>
+      </w:r>
+    </w:p>
+    <w:p>
+      <w:pPr>
+        <w:rPr>
+          <w:b/>
+          <w:bCs/>
+        </w:rPr>
+      </w:pPr>
+      <w:r>
+        <w:rPr>
+          <w:b/>
+          <w:bCs/>
+        </w:rPr>
+        <w:t>.\</w:t>
+      </w:r>
       <w:proofErr w:type="spellStart"/>
       <w:r>
         <w:rPr>
           <w:b/>
           <w:bCs/>
         </w:rPr>
-        <w:t>npm</w:t>
+        <w:t>venv</w:t>
       </w:r>
       <w:proofErr w:type="spellEnd"/>
       <w:r>
@@ -1094,7 +1357,22 @@
           <w:b/>
           <w:bCs/>
         </w:rPr>
-        <w:t xml:space="preserve"> install --prefix </w:t>
+        <w:t>\Scripts\activate</w:t>
+      </w:r>
+    </w:p>
+    <w:p>
+      <w:pPr>
+        <w:rPr>
+          <w:b/>
+          <w:bCs/>
+        </w:rPr>
+      </w:pPr>
+      <w:r>
+        <w:rPr>
+          <w:b/>
+          <w:bCs/>
+        </w:rPr>
+        <w:t># (Your terminal prompt should now show '(</w:t>
       </w:r>
       <w:proofErr w:type="spellStart"/>
       <w:r>
@@ -1102,7 +1380,7 @@
           <w:b/>
           <w:bCs/>
         </w:rPr>
-        <w:t>ResaleSense</w:t>
+        <w:t>venv</w:t>
       </w:r>
       <w:proofErr w:type="spellEnd"/>
       <w:r>
@@ -1110,612 +1388,6 @@
           <w:b/>
           <w:bCs/>
         </w:rPr>
-        <w:t xml:space="preserve">-Backend </w:t>
-      </w:r>
-    </w:p>
-    <w:p>
-      <w:pPr>
-        <w:rPr>
-          <w:b/>
-          <w:bCs/>
-        </w:rPr>
-      </w:pPr>
-    </w:p>
-    <w:p>
-      <w:pPr>
-        <w:rPr>
-          <w:b/>
-          <w:bCs/>
-        </w:rPr>
-      </w:pPr>
-      <w:r>
-        <w:rPr>
-          <w:b/>
-          <w:bCs/>
-        </w:rPr>
-        <w:t># 4. Install Frontend dependencies (from the root folder)</w:t>
-      </w:r>
-    </w:p>
-    <w:p>
-      <w:pPr>
-        <w:rPr>
-          <w:b/>
-          <w:bCs/>
-        </w:rPr>
-      </w:pPr>
-      <w:proofErr w:type="spellStart"/>
-      <w:r>
-        <w:rPr>
-          <w:b/>
-          <w:bCs/>
-        </w:rPr>
-        <w:t>npm</w:t>
-      </w:r>
-      <w:proofErr w:type="spellEnd"/>
-      <w:r>
-        <w:rPr>
-          <w:b/>
-          <w:bCs/>
-        </w:rPr>
-        <w:t xml:space="preserve"> install --prefix </w:t>
-      </w:r>
-      <w:proofErr w:type="spellStart"/>
-      <w:r>
-        <w:rPr>
-          <w:b/>
-          <w:bCs/>
-        </w:rPr>
-        <w:t>resalesense</w:t>
-      </w:r>
-      <w:proofErr w:type="spellEnd"/>
-      <w:r>
-        <w:rPr>
-          <w:b/>
-          <w:bCs/>
-        </w:rPr>
-        <w:t xml:space="preserve">-frontend </w:t>
-      </w:r>
-    </w:p>
-    <w:p>
-      <w:pPr>
-        <w:rPr>
-          <w:b/>
-          <w:bCs/>
-        </w:rPr>
-      </w:pPr>
-      <w:r>
-        <w:rPr>
-          <w:b/>
-          <w:bCs/>
-        </w:rPr>
-        <w:t>Step 2: Configure the Backend (.env)</w:t>
-      </w:r>
-    </w:p>
-    <w:p>
-      <w:pPr>
-        <w:rPr>
-          <w:b/>
-          <w:bCs/>
-        </w:rPr>
-      </w:pPr>
-      <w:r>
-        <w:rPr>
-          <w:b/>
-          <w:bCs/>
-        </w:rPr>
-        <w:t>The backend needs to know how to connect to your MongoDB database.</w:t>
-      </w:r>
-    </w:p>
-    <w:p>
-      <w:pPr>
-        <w:rPr>
-          <w:b/>
-          <w:bCs/>
-        </w:rPr>
-      </w:pPr>
-      <w:r>
-        <w:rPr>
-          <w:b/>
-          <w:bCs/>
-        </w:rPr>
-        <w:t>Bash</w:t>
-      </w:r>
-    </w:p>
-    <w:p>
-      <w:pPr>
-        <w:rPr>
-          <w:b/>
-          <w:bCs/>
-        </w:rPr>
-      </w:pPr>
-      <w:r>
-        <w:rPr>
-          <w:b/>
-          <w:bCs/>
-        </w:rPr>
-        <w:t># 1. From the root '</w:t>
-      </w:r>
-      <w:proofErr w:type="spellStart"/>
-      <w:r>
-        <w:rPr>
-          <w:b/>
-          <w:bCs/>
-        </w:rPr>
-        <w:t>ResaleSense</w:t>
-      </w:r>
-      <w:proofErr w:type="spellEnd"/>
-      <w:r>
-        <w:rPr>
-          <w:b/>
-          <w:bCs/>
-        </w:rPr>
-        <w:t>-Project' folder, copy the example .env file</w:t>
-      </w:r>
-    </w:p>
-    <w:p>
-      <w:pPr>
-        <w:rPr>
-          <w:b/>
-          <w:bCs/>
-        </w:rPr>
-      </w:pPr>
-      <w:r>
-        <w:rPr>
-          <w:b/>
-          <w:bCs/>
-        </w:rPr>
-        <w:t xml:space="preserve">cp </w:t>
-      </w:r>
-      <w:proofErr w:type="spellStart"/>
-      <w:r>
-        <w:rPr>
-          <w:b/>
-          <w:bCs/>
-        </w:rPr>
-        <w:t>ResaleSense</w:t>
-      </w:r>
-      <w:proofErr w:type="spellEnd"/>
-      <w:r>
-        <w:rPr>
-          <w:b/>
-          <w:bCs/>
-        </w:rPr>
-        <w:t>-Backend</w:t>
-      </w:r>
-      <w:proofErr w:type="gramStart"/>
-      <w:r>
-        <w:rPr>
-          <w:b/>
-          <w:bCs/>
-        </w:rPr>
-        <w:t>/.</w:t>
-      </w:r>
-      <w:proofErr w:type="spellStart"/>
-      <w:r>
-        <w:rPr>
-          <w:b/>
-          <w:bCs/>
-        </w:rPr>
-        <w:t>env</w:t>
-      </w:r>
-      <w:proofErr w:type="gramEnd"/>
-      <w:r>
-        <w:rPr>
-          <w:b/>
-          <w:bCs/>
-        </w:rPr>
-        <w:t>.example</w:t>
-      </w:r>
-      <w:proofErr w:type="spellEnd"/>
-      <w:r>
-        <w:rPr>
-          <w:b/>
-          <w:bCs/>
-        </w:rPr>
-        <w:t xml:space="preserve"> </w:t>
-      </w:r>
-      <w:proofErr w:type="spellStart"/>
-      <w:r>
-        <w:rPr>
-          <w:b/>
-          <w:bCs/>
-        </w:rPr>
-        <w:t>ResaleSense</w:t>
-      </w:r>
-      <w:proofErr w:type="spellEnd"/>
-      <w:r>
-        <w:rPr>
-          <w:b/>
-          <w:bCs/>
-        </w:rPr>
-        <w:t>-Backend</w:t>
-      </w:r>
-      <w:proofErr w:type="gramStart"/>
-      <w:r>
-        <w:rPr>
-          <w:b/>
-          <w:bCs/>
-        </w:rPr>
-        <w:t>/.env</w:t>
-      </w:r>
-      <w:proofErr w:type="gramEnd"/>
-      <w:r>
-        <w:rPr>
-          <w:b/>
-          <w:bCs/>
-        </w:rPr>
-        <w:t xml:space="preserve"> </w:t>
-      </w:r>
-    </w:p>
-    <w:p>
-      <w:pPr>
-        <w:rPr>
-          <w:b/>
-          <w:bCs/>
-        </w:rPr>
-      </w:pPr>
-    </w:p>
-    <w:p>
-      <w:pPr>
-        <w:rPr>
-          <w:b/>
-          <w:bCs/>
-        </w:rPr>
-      </w:pPr>
-      <w:r>
-        <w:rPr>
-          <w:b/>
-          <w:bCs/>
-        </w:rPr>
-        <w:t xml:space="preserve"># 2. Open the new file: </w:t>
-      </w:r>
-      <w:proofErr w:type="spellStart"/>
-      <w:r>
-        <w:rPr>
-          <w:b/>
-          <w:bCs/>
-        </w:rPr>
-        <w:t>ResaleSense</w:t>
-      </w:r>
-      <w:proofErr w:type="spellEnd"/>
-      <w:r>
-        <w:rPr>
-          <w:b/>
-          <w:bCs/>
-        </w:rPr>
-        <w:t>-Backend</w:t>
-      </w:r>
-      <w:proofErr w:type="gramStart"/>
-      <w:r>
-        <w:rPr>
-          <w:b/>
-          <w:bCs/>
-        </w:rPr>
-        <w:t>/.env</w:t>
-      </w:r>
-      <w:proofErr w:type="gramEnd"/>
-    </w:p>
-    <w:p>
-      <w:pPr>
-        <w:rPr>
-          <w:b/>
-          <w:bCs/>
-        </w:rPr>
-      </w:pPr>
-      <w:r>
-        <w:rPr>
-          <w:b/>
-          <w:bCs/>
-        </w:rPr>
-        <w:t>Inside this file, change this line:</w:t>
-      </w:r>
-    </w:p>
-    <w:p>
-      <w:pPr>
-        <w:rPr>
-          <w:b/>
-          <w:bCs/>
-        </w:rPr>
-      </w:pPr>
-      <w:r>
-        <w:rPr>
-          <w:b/>
-          <w:bCs/>
-        </w:rPr>
-        <w:lastRenderedPageBreak/>
-        <w:t>MONGODB_URI=YOUR_MONGODB_CONNECTION_STRING</w:t>
-      </w:r>
-    </w:p>
-    <w:p>
-      <w:pPr>
-        <w:rPr>
-          <w:b/>
-          <w:bCs/>
-        </w:rPr>
-      </w:pPr>
-      <w:r>
-        <w:rPr>
-          <w:b/>
-          <w:bCs/>
-        </w:rPr>
-        <w:t>...to this (if you used the Homebrew install):</w:t>
-      </w:r>
-    </w:p>
-    <w:p>
-      <w:pPr>
-        <w:rPr>
-          <w:b/>
-          <w:bCs/>
-        </w:rPr>
-      </w:pPr>
-      <w:r>
-        <w:rPr>
-          <w:b/>
-          <w:bCs/>
-        </w:rPr>
-        <w:t>MONGODB_URI=mongodb://localhost:27017/resalesense</w:t>
-      </w:r>
-    </w:p>
-    <w:p>
-      <w:pPr>
-        <w:rPr>
-          <w:b/>
-          <w:bCs/>
-        </w:rPr>
-      </w:pPr>
-      <w:r>
-        <w:rPr>
-          <w:b/>
-          <w:bCs/>
-        </w:rPr>
-        <w:t>(If you're using MongoDB Atlas, paste your cloud connection string here.) 1</w:t>
-      </w:r>
-    </w:p>
-    <w:p>
-      <w:pPr>
-        <w:rPr>
-          <w:b/>
-          <w:bCs/>
-        </w:rPr>
-      </w:pPr>
-      <w:r>
-        <w:rPr>
-          <w:b/>
-          <w:bCs/>
-        </w:rPr>
-        <w:t>Step 3: Configure the Python Service (Virtual Environment)</w:t>
-      </w:r>
-    </w:p>
-    <w:p>
-      <w:pPr>
-        <w:rPr>
-          <w:b/>
-          <w:bCs/>
-        </w:rPr>
-      </w:pPr>
-      <w:r>
-        <w:rPr>
-          <w:b/>
-          <w:bCs/>
-        </w:rPr>
-        <w:t>This creates a self-contained Python environment so it doesn't mess with your main system.</w:t>
-      </w:r>
-    </w:p>
-    <w:p>
-      <w:pPr>
-        <w:rPr>
-          <w:b/>
-          <w:bCs/>
-        </w:rPr>
-      </w:pPr>
-      <w:r>
-        <w:rPr>
-          <w:b/>
-          <w:bCs/>
-        </w:rPr>
-        <w:t>Bash</w:t>
-      </w:r>
-    </w:p>
-    <w:p>
-      <w:pPr>
-        <w:rPr>
-          <w:b/>
-          <w:bCs/>
-        </w:rPr>
-      </w:pPr>
-      <w:r>
-        <w:rPr>
-          <w:b/>
-          <w:bCs/>
-        </w:rPr>
-        <w:t># 1. Navigate into the Python folder</w:t>
-      </w:r>
-    </w:p>
-    <w:p>
-      <w:pPr>
-        <w:rPr>
-          <w:b/>
-          <w:bCs/>
-        </w:rPr>
-      </w:pPr>
-      <w:r>
-        <w:rPr>
-          <w:b/>
-          <w:bCs/>
-        </w:rPr>
-        <w:t xml:space="preserve">cd </w:t>
-      </w:r>
-      <w:proofErr w:type="spellStart"/>
-      <w:r>
-        <w:rPr>
-          <w:b/>
-          <w:bCs/>
-        </w:rPr>
-        <w:t>ResaleSense</w:t>
-      </w:r>
-      <w:proofErr w:type="spellEnd"/>
-      <w:r>
-        <w:rPr>
-          <w:b/>
-          <w:bCs/>
-        </w:rPr>
-        <w:t xml:space="preserve">-Prediction-Service </w:t>
-      </w:r>
-    </w:p>
-    <w:p>
-      <w:pPr>
-        <w:rPr>
-          <w:b/>
-          <w:bCs/>
-        </w:rPr>
-      </w:pPr>
-    </w:p>
-    <w:p>
-      <w:pPr>
-        <w:rPr>
-          <w:b/>
-          <w:bCs/>
-        </w:rPr>
-      </w:pPr>
-      <w:r>
-        <w:rPr>
-          <w:b/>
-          <w:bCs/>
-        </w:rPr>
-        <w:t># 2. Create the virtual environment (use python3 for Mac)</w:t>
-      </w:r>
-    </w:p>
-    <w:p>
-      <w:pPr>
-        <w:rPr>
-          <w:b/>
-          <w:bCs/>
-        </w:rPr>
-      </w:pPr>
-      <w:r>
-        <w:rPr>
-          <w:b/>
-          <w:bCs/>
-        </w:rPr>
-        <w:t xml:space="preserve">python3 -m </w:t>
-      </w:r>
-      <w:proofErr w:type="spellStart"/>
-      <w:r>
-        <w:rPr>
-          <w:b/>
-          <w:bCs/>
-        </w:rPr>
-        <w:t>venv</w:t>
-      </w:r>
-      <w:proofErr w:type="spellEnd"/>
-      <w:r>
-        <w:rPr>
-          <w:b/>
-          <w:bCs/>
-        </w:rPr>
-        <w:t xml:space="preserve"> </w:t>
-      </w:r>
-      <w:proofErr w:type="spellStart"/>
-      <w:r>
-        <w:rPr>
-          <w:b/>
-          <w:bCs/>
-        </w:rPr>
-        <w:t>venv</w:t>
-      </w:r>
-      <w:proofErr w:type="spellEnd"/>
-      <w:r>
-        <w:rPr>
-          <w:b/>
-          <w:bCs/>
-        </w:rPr>
-        <w:t xml:space="preserve"> </w:t>
-      </w:r>
-    </w:p>
-    <w:p>
-      <w:pPr>
-        <w:rPr>
-          <w:b/>
-          <w:bCs/>
-        </w:rPr>
-      </w:pPr>
-    </w:p>
-    <w:p>
-      <w:pPr>
-        <w:rPr>
-          <w:b/>
-          <w:bCs/>
-        </w:rPr>
-      </w:pPr>
-      <w:r>
-        <w:rPr>
-          <w:b/>
-          <w:bCs/>
-        </w:rPr>
-        <w:t># 3. Activate the environment</w:t>
-      </w:r>
-    </w:p>
-    <w:p>
-      <w:pPr>
-        <w:rPr>
-          <w:b/>
-          <w:bCs/>
-        </w:rPr>
-      </w:pPr>
-      <w:proofErr w:type="gramStart"/>
-      <w:r>
-        <w:rPr>
-          <w:b/>
-          <w:bCs/>
-        </w:rPr>
-        <w:t>.\</w:t>
-      </w:r>
-      <w:proofErr w:type="spellStart"/>
-      <w:r>
-        <w:rPr>
-          <w:b/>
-          <w:bCs/>
-        </w:rPr>
-        <w:t>venv</w:t>
-      </w:r>
-      <w:proofErr w:type="spellEnd"/>
-      <w:r>
-        <w:rPr>
-          <w:b/>
-          <w:bCs/>
-        </w:rPr>
-        <w:t>\Scripts\activate</w:t>
-      </w:r>
-      <w:proofErr w:type="gramEnd"/>
-    </w:p>
-    <w:p>
-      <w:pPr>
-        <w:rPr>
-          <w:b/>
-          <w:bCs/>
-        </w:rPr>
-      </w:pPr>
-      <w:r>
-        <w:rPr>
-          <w:b/>
-          <w:bCs/>
-        </w:rPr>
-        <w:t># (Your terminal prompt should now show '(</w:t>
-      </w:r>
-      <w:proofErr w:type="spellStart"/>
-      <w:r>
-        <w:rPr>
-          <w:b/>
-          <w:bCs/>
-        </w:rPr>
-        <w:t>venv</w:t>
-      </w:r>
-      <w:proofErr w:type="spellEnd"/>
-      <w:r>
-        <w:rPr>
-          <w:b/>
-          <w:bCs/>
-        </w:rPr>
         <w:t>)' at the start)</w:t>
       </w:r>
     </w:p>
@@ -1792,23 +1464,7 @@
           <w:b/>
           <w:bCs/>
         </w:rPr>
-        <w:t>cd</w:t>
-      </w:r>
-      <w:proofErr w:type="gramStart"/>
-      <w:r>
-        <w:rPr>
-          <w:b/>
-          <w:bCs/>
-        </w:rPr>
-        <w:t xml:space="preserve"> ..</w:t>
-      </w:r>
-      <w:proofErr w:type="gramEnd"/>
-      <w:r>
-        <w:rPr>
-          <w:b/>
-          <w:bCs/>
-        </w:rPr>
-        <w:t xml:space="preserve"> </w:t>
+        <w:t xml:space="preserve">cd .. </w:t>
       </w:r>
     </w:p>
     <w:p>
@@ -1970,22 +1626,21 @@
           <w:b/>
           <w:bCs/>
         </w:rPr>
-        <w:t xml:space="preserve"> start [cite: 1810]</w:t>
-      </w:r>
-    </w:p>
-    <w:p>
-      <w:pPr>
-        <w:rPr>
-          <w:b/>
-          <w:bCs/>
-        </w:rPr>
-      </w:pPr>
-      <w:r>
-        <w:rPr>
-          <w:b/>
-          <w:bCs/>
-        </w:rPr>
-        <w:lastRenderedPageBreak/>
+        <w:t xml:space="preserve"> start </w:t>
+      </w:r>
+    </w:p>
+    <w:p>
+      <w:pPr>
+        <w:rPr>
+          <w:b/>
+          <w:bCs/>
+        </w:rPr>
+      </w:pPr>
+      <w:r>
+        <w:rPr>
+          <w:b/>
+          <w:bCs/>
+        </w:rPr>
         <w:t>You will see output from all three services mixed together</w:t>
       </w:r>
       <w:r>
@@ -2182,6 +1837,7 @@
           <w:b/>
           <w:bCs/>
         </w:rPr>
+        <w:lastRenderedPageBreak/>
         <w:t># Wait for: [Node.js] Backend server is running on http://localhost:4000</w:t>
       </w:r>
     </w:p>
@@ -2637,7 +2293,7 @@
           <w:b/>
           <w:bCs/>
         </w:rPr>
-        <w:t>-Backend [cite: 1830]</w:t>
+        <w:t xml:space="preserve">-Backend </w:t>
       </w:r>
     </w:p>
     <w:p>
@@ -2686,8 +2342,7 @@
           <w:b/>
           <w:bCs/>
         </w:rPr>
-        <w:lastRenderedPageBreak/>
-        <w:t>node createAdmin.js [cite: 1833]</w:t>
+        <w:t xml:space="preserve">node createAdmin.js </w:t>
       </w:r>
     </w:p>
     <w:p>
@@ -2770,23 +2425,7 @@
           <w:b/>
           <w:bCs/>
         </w:rPr>
-        <w:t>cd</w:t>
-      </w:r>
-      <w:proofErr w:type="gramStart"/>
-      <w:r>
-        <w:rPr>
-          <w:b/>
-          <w:bCs/>
-        </w:rPr>
-        <w:t xml:space="preserve"> ..</w:t>
-      </w:r>
-      <w:proofErr w:type="gramEnd"/>
-      <w:r>
-        <w:rPr>
-          <w:b/>
-          <w:bCs/>
-        </w:rPr>
-        <w:t xml:space="preserve"> [cite: 1837]</w:t>
+        <w:t xml:space="preserve">cd .. </w:t>
       </w:r>
     </w:p>
     <w:p>
@@ -2913,6 +2552,7 @@
           <w:b/>
           <w:bCs/>
         </w:rPr>
+        <w:lastRenderedPageBreak/>
         <w:t>This section is to help if things go wrong.</w:t>
       </w:r>
     </w:p>
@@ -6629,6 +6269,7 @@
   <w:style w:type="character" w:default="1" w:styleId="DefaultParagraphFont">
     <w:name w:val="Default Paragraph Font"/>
     <w:uiPriority w:val="1"/>
+    <w:semiHidden/>
     <w:unhideWhenUsed/>
   </w:style>
   <w:style w:type="table" w:default="1" w:styleId="TableNormal">

</xml_diff>